<commit_message>
Adiciona CTA com comentário PORTAL ao carrossel e cria peça estática de convite ao grupo Eleva Síndicos de Alta Performance, com CTA GRUPO
Co-Authored-By: Claude Sonnet 5 <noreply@anthropic.com>
Claude-Session: https://claude.ai/code/session_01GQSqEjEuqv44iBdACeUWUZ
</commit_message>
<xml_diff>
--- a/eleva/carrossel-lancamento-portal-sindico.docx
+++ b/eleva/carrossel-lancamento-portal-sindico.docx
@@ -8,7 +8,7 @@
         <w:spacing w:after="200"/>
       </w:pPr>
       <w:r>
-        <w:t xml:space="preserve">Carrossel — Lançamento do Portal do Síndico</w:t>
+        <w:t xml:space="preserve">Carrossel do Portal do Síndico e Convite para o Grupo</w:t>
       </w:r>
     </w:p>
     <w:p>
@@ -23,7 +23,7 @@
           <w:sz w:val="18"/>
           <w:szCs w:val="18"/>
         </w:rPr>
-        <w:t xml:space="preserve">RECRIA Marketing, 02/10/2026</w:t>
+        <w:t xml:space="preserve">RECRIA Marketing, atualizado em 05/10/2026</w:t>
       </w:r>
     </w:p>
     <w:p>
@@ -428,7 +428,7 @@
           <w:sz w:val="21"/>
           <w:szCs w:val="21"/>
         </w:rPr>
-        <w:t xml:space="preserve">"Acesse pelo link da bio e saiba mais."</w:t>
+        <w:t xml:space="preserve">"Comenta 'PORTAL' que avisamos você assim que lançar, ou acesse pelo link da bio."</w:t>
       </w:r>
     </w:p>
     <w:p>
@@ -494,7 +494,263 @@
           <w:sz w:val="21"/>
           <w:szCs w:val="21"/>
         </w:rPr>
-        <w:t xml:space="preserve">Acesse pelo link da bio e saiba mais. 👇</w:t>
+        <w:t xml:space="preserve">Comenta "PORTAL" 👇 ou acesse pelo link da bio.</w:t>
+      </w:r>
+    </w:p>
+    <w:p>
+      <w:pPr>
+        <w:spacing w:after="160"/>
+      </w:pPr>
+      <w:r>
+        <w:rPr>
+          <w:b/>
+          <w:bCs/>
+          <w:sz w:val="21"/>
+          <w:szCs w:val="21"/>
+        </w:rPr>
+        <w:t xml:space="preserve">Automação de direct (gatilho: comentário "PORTAL"):</w:t>
+      </w:r>
+      <w:r>
+        <w:rPr>
+          <w:sz w:val="21"/>
+          <w:szCs w:val="21"/>
+        </w:rPr>
+        <w:t xml:space="preserve"> avisar que a pessoa será notificada assim que o portal for lançado, com acesso ao período gratuito de teste.</w:t>
+      </w:r>
+    </w:p>
+    <w:p>
+      <w:pPr>
+        <w:pBdr>
+          <w:bottom w:val="single" w:color="cccccc" w:sz="6" w:space="4"/>
+        </w:pBdr>
+        <w:spacing w:after="200"/>
+      </w:pPr>
+    </w:p>
+    <w:p>
+      <w:pPr>
+        <w:pStyle w:val="Heading1"/>
+        <w:spacing w:after="200"/>
+      </w:pPr>
+      <w:r>
+        <w:t xml:space="preserve">Imagem estática — Convite para o grupo Eleva, Síndicos de Alta Performance</w:t>
+      </w:r>
+    </w:p>
+    <w:p>
+      <w:pPr>
+        <w:spacing w:after="160"/>
+      </w:pPr>
+      <w:r>
+        <w:rPr>
+          <w:b/>
+          <w:bCs/>
+          <w:sz w:val="21"/>
+          <w:szCs w:val="21"/>
+        </w:rPr>
+        <w:t xml:space="preserve">Onde postar:</w:t>
+      </w:r>
+      <w:r>
+        <w:rPr>
+          <w:sz w:val="21"/>
+          <w:szCs w:val="21"/>
+        </w:rPr>
+        <w:t xml:space="preserve"> Instagram, feed (imagem estática)</w:t>
+      </w:r>
+    </w:p>
+    <w:p>
+      <w:pPr>
+        <w:spacing w:after="160"/>
+      </w:pPr>
+      <w:r>
+        <w:rPr>
+          <w:b/>
+          <w:bCs/>
+          <w:sz w:val="21"/>
+          <w:szCs w:val="21"/>
+        </w:rPr>
+        <w:t xml:space="preserve">Quem produz:</w:t>
+      </w:r>
+      <w:r>
+        <w:rPr>
+          <w:sz w:val="21"/>
+          <w:szCs w:val="21"/>
+        </w:rPr>
+        <w:t xml:space="preserve"> Amanda</w:t>
+      </w:r>
+    </w:p>
+    <w:p>
+      <w:pPr>
+        <w:spacing w:after="160"/>
+      </w:pPr>
+      <w:r>
+        <w:rPr>
+          <w:b/>
+          <w:bCs/>
+          <w:sz w:val="21"/>
+          <w:szCs w:val="21"/>
+        </w:rPr>
+        <w:t xml:space="preserve">Layout:</w:t>
+      </w:r>
+      <w:r>
+        <w:rPr>
+          <w:sz w:val="21"/>
+          <w:szCs w:val="21"/>
+        </w:rPr>
+        <w:t xml:space="preserve"> mesma identidade visual do carrossel acima, para manter consistência.</w:t>
+      </w:r>
+    </w:p>
+    <w:p>
+      <w:pPr>
+        <w:spacing w:after="80"/>
+      </w:pPr>
+      <w:r>
+        <w:rPr>
+          <w:i/>
+          <w:iCs/>
+          <w:color w:val="555555"/>
+          <w:sz w:val="18"/>
+          <w:szCs w:val="18"/>
+        </w:rPr>
+        <w:t xml:space="preserve">Texto da imagem:</w:t>
+      </w:r>
+    </w:p>
+    <w:p>
+      <w:pPr>
+        <w:spacing w:after="160"/>
+      </w:pPr>
+      <w:r>
+        <w:rPr>
+          <w:sz w:val="21"/>
+          <w:szCs w:val="21"/>
+        </w:rPr>
+        <w:t xml:space="preserve">"Você é síndico e ainda não faz parte da nossa comunidade, Eleva Síndicos de Alta Performance?"</w:t>
+      </w:r>
+    </w:p>
+    <w:p>
+      <w:pPr>
+        <w:spacing w:after="160"/>
+      </w:pPr>
+      <w:r>
+        <w:rPr>
+          <w:sz w:val="21"/>
+          <w:szCs w:val="21"/>
+        </w:rPr>
+        <w:t xml:space="preserve">"Uma comunidade gratuita, no WhatsApp, com conteúdo semanal para o seu dia a dia de gestão."</w:t>
+      </w:r>
+    </w:p>
+    <w:p>
+      <w:pPr>
+        <w:spacing w:after="160"/>
+      </w:pPr>
+      <w:r>
+        <w:rPr>
+          <w:sz w:val="21"/>
+          <w:szCs w:val="21"/>
+        </w:rPr>
+        <w:t xml:space="preserve">"Comenta 'GRUPO' ou acesse pelo link da bio."</w:t>
+      </w:r>
+    </w:p>
+    <w:p>
+      <w:pPr>
+        <w:spacing w:after="80"/>
+      </w:pPr>
+      <w:r>
+        <w:rPr>
+          <w:i/>
+          <w:iCs/>
+          <w:color w:val="555555"/>
+          <w:sz w:val="18"/>
+          <w:szCs w:val="18"/>
+        </w:rPr>
+        <w:t xml:space="preserve">Legenda do post:</w:t>
+      </w:r>
+    </w:p>
+    <w:p>
+      <w:pPr>
+        <w:spacing w:after="160"/>
+      </w:pPr>
+      <w:r>
+        <w:rPr>
+          <w:sz w:val="21"/>
+          <w:szCs w:val="21"/>
+        </w:rPr>
+        <w:t xml:space="preserve">Você é síndico e ainda não faz parte da nossa comunidade, Eleva Síndicos de Alta Performance?</w:t>
+      </w:r>
+    </w:p>
+    <w:p>
+      <w:pPr>
+        <w:spacing w:after="160"/>
+      </w:pPr>
+      <w:r>
+        <w:rPr>
+          <w:sz w:val="21"/>
+          <w:szCs w:val="21"/>
+        </w:rPr>
+        <w:t xml:space="preserve">Uma comunidade gratuita, no WhatsApp, com conteúdo semanal para o seu dia a dia de gestão.</w:t>
+      </w:r>
+    </w:p>
+    <w:p>
+      <w:pPr>
+        <w:spacing w:after="160"/>
+      </w:pPr>
+      <w:r>
+        <w:rPr>
+          <w:sz w:val="21"/>
+          <w:szCs w:val="21"/>
+        </w:rPr>
+        <w:t xml:space="preserve">Comenta "GRUPO" 👇 que você recebe o convite no direct, ou acesse direto pelo link da bio.</w:t>
+      </w:r>
+    </w:p>
+    <w:p>
+      <w:pPr>
+        <w:spacing w:after="80"/>
+      </w:pPr>
+      <w:r>
+        <w:rPr>
+          <w:i/>
+          <w:iCs/>
+          <w:color w:val="555555"/>
+          <w:sz w:val="18"/>
+          <w:szCs w:val="18"/>
+        </w:rPr>
+        <w:t xml:space="preserve">Automação de direct (gatilho: comentário "GRUPO"):</w:t>
+      </w:r>
+    </w:p>
+    <w:p>
+      <w:pPr>
+        <w:pBdr>
+          <w:left w:val="single" w:color="cccccc" w:sz="12" w:space="8"/>
+        </w:pBdr>
+        <w:spacing w:after="120"/>
+        <w:ind w:left="400"/>
+      </w:pPr>
+      <w:r>
+        <w:rPr>
+          <w:i/>
+          <w:iCs/>
+          <w:color w:val="333333"/>
+          <w:sz w:val="20"/>
+          <w:szCs w:val="20"/>
+        </w:rPr>
+        <w:t xml:space="preserve">Oi, [nome], tudo bem? Que bom que você quer fazer parte da comunidade Eleva lá no WhatsApp. Para participar, basta clicar no link abaixo. Nos vemos na comunidade. Um abraço!</w:t>
+      </w:r>
+    </w:p>
+    <w:p>
+      <w:pPr>
+        <w:pBdr>
+          <w:left w:val="single" w:color="cccccc" w:sz="12" w:space="8"/>
+        </w:pBdr>
+        <w:spacing w:after="120"/>
+        <w:ind w:left="400"/>
+      </w:pPr>
+      <w:r>
+        <w:rPr>
+          <w:i/>
+          <w:iCs/>
+          <w:color w:val="333333"/>
+          <w:sz w:val="20"/>
+          <w:szCs w:val="20"/>
+        </w:rPr>
+        <w:t xml:space="preserve">🔗 https://chat.whatsapp.com/IPCOutpwO2rLJF2KmP99t9</w:t>
       </w:r>
     </w:p>
     <w:sectPr>

</xml_diff>

<commit_message>
Ajusta slides 1, 2, 3, 4, 6 e 7 do carrossel do portal conforme revisão
Co-Authored-By: Claude Sonnet 5 <noreply@anthropic.com>
Claude-Session: https://claude.ai/code/session_01GQSqEjEuqv44iBdACeUWUZ
</commit_message>
<xml_diff>
--- a/eleva/carrossel-lancamento-portal-sindico.docx
+++ b/eleva/carrossel-lancamento-portal-sindico.docx
@@ -196,7 +196,7 @@
           <w:sz w:val="21"/>
           <w:szCs w:val="21"/>
         </w:rPr>
-        <w:t xml:space="preserve">"Se esse é o seu caso, arrasta para o lado 👉"</w:t>
+        <w:t xml:space="preserve">"E agora, essa gestão ficou mais fácil &gt;&gt;"</w:t>
       </w:r>
     </w:p>
     <w:p>
@@ -223,7 +223,7 @@
           <w:sz w:val="21"/>
           <w:szCs w:val="21"/>
         </w:rPr>
-        <w:t xml:space="preserve">"Prestação de contas, assembleia, conselho, administradora, cada um puxando pra um lado, e tudo dependendo da sua memória e das suas planilhas."</w:t>
+        <w:t xml:space="preserve">"Prestação de contas, assembleia, conselho, administradora, diversas responsabilidades, e tudo dependendo da sua memória e das suas planilhas."</w:t>
       </w:r>
     </w:p>
     <w:p>
@@ -250,7 +250,7 @@
           <w:sz w:val="21"/>
           <w:szCs w:val="21"/>
         </w:rPr>
-        <w:t xml:space="preserve">"E quando alguma coisa passa batido, quem segura a cobrança é você."</w:t>
+        <w:t xml:space="preserve">"E quando algum ponto passa despercebido, quem precisa lidar com a cobrança é você."</w:t>
       </w:r>
     </w:p>
     <w:p>
@@ -278,6 +278,18 @@
           <w:szCs w:val="21"/>
         </w:rPr>
         <w:t xml:space="preserve">"Por isso estamos desenvolvendo o Portal do Síndico da Eleva. Feito para facilitar a sua gestão do início ao fim."</w:t>
+      </w:r>
+    </w:p>
+    <w:p>
+      <w:pPr>
+        <w:spacing w:after="160"/>
+      </w:pPr>
+      <w:r>
+        <w:rPr>
+          <w:sz w:val="21"/>
+          <w:szCs w:val="21"/>
+        </w:rPr>
+        <w:t xml:space="preserve">"E você terá acesso cortesia para experimentar..."</w:t>
       </w:r>
     </w:p>
     <w:p>
@@ -401,7 +413,7 @@
           <w:sz w:val="21"/>
           <w:szCs w:val="21"/>
         </w:rPr>
-        <w:t xml:space="preserve">"Em breve, com período gratuito para você testar."</w:t>
+        <w:t xml:space="preserve">"Quer ser um dos primeiros a receber o acesso gratuito para você testar na sua gestão?"</w:t>
       </w:r>
     </w:p>
     <w:p>
@@ -428,7 +440,19 @@
           <w:sz w:val="21"/>
           <w:szCs w:val="21"/>
         </w:rPr>
-        <w:t xml:space="preserve">"Comenta 'PORTAL' que avisamos você assim que lançar, ou acesse pelo link da bio."</w:t>
+        <w:t xml:space="preserve">"Comente: PORTAL</w:t>
+      </w:r>
+    </w:p>
+    <w:p>
+      <w:pPr>
+        <w:spacing w:after="160"/>
+      </w:pPr>
+      <w:r>
+        <w:rPr>
+          <w:sz w:val="21"/>
+          <w:szCs w:val="21"/>
+        </w:rPr>
+        <w:t xml:space="preserve">Vamos te avisar e passar o acesso no seu direct."</w:t>
       </w:r>
     </w:p>
     <w:p>
@@ -470,31 +494,31 @@
           <w:sz w:val="21"/>
           <w:szCs w:val="21"/>
         </w:rPr>
-        <w:t xml:space="preserve">Prestação de contas, assembleia, conselho, administradora, cada um puxando pra um lado, tudo dependendo da sua memória. E quando algo passa batido, quem segura a cobrança é você.</w:t>
-      </w:r>
-    </w:p>
-    <w:p>
-      <w:pPr>
-        <w:spacing w:after="160"/>
-      </w:pPr>
-      <w:r>
-        <w:rPr>
-          <w:sz w:val="21"/>
-          <w:szCs w:val="21"/>
-        </w:rPr>
-        <w:t xml:space="preserve">Por isso estamos desenvolvendo o Portal do Síndico da Eleva, feito para facilitar sua gestão do início ao fim, em breve, com período gratuito para testar.</w:t>
-      </w:r>
-    </w:p>
-    <w:p>
-      <w:pPr>
-        <w:spacing w:after="160"/>
-      </w:pPr>
-      <w:r>
-        <w:rPr>
-          <w:sz w:val="21"/>
-          <w:szCs w:val="21"/>
-        </w:rPr>
-        <w:t xml:space="preserve">Comenta "PORTAL" 👇 ou acesse pelo link da bio.</w:t>
+        <w:t xml:space="preserve">Prestação de contas, assembleia, conselho, administradora, diversas responsabilidades, tudo dependendo da sua memória. E quando algum ponto passa despercebido, quem precisa lidar com a cobrança é você.</w:t>
+      </w:r>
+    </w:p>
+    <w:p>
+      <w:pPr>
+        <w:spacing w:after="160"/>
+      </w:pPr>
+      <w:r>
+        <w:rPr>
+          <w:sz w:val="21"/>
+          <w:szCs w:val="21"/>
+        </w:rPr>
+        <w:t xml:space="preserve">Por isso estamos desenvolvendo o Portal do Síndico da Eleva, feito para facilitar sua gestão do início ao fim, com acesso cortesia para você experimentar.</w:t>
+      </w:r>
+    </w:p>
+    <w:p>
+      <w:pPr>
+        <w:spacing w:after="160"/>
+      </w:pPr>
+      <w:r>
+        <w:rPr>
+          <w:sz w:val="21"/>
+          <w:szCs w:val="21"/>
+        </w:rPr>
+        <w:t xml:space="preserve">Quer ser um dos primeiros a receber esse acesso gratuito? Comente "PORTAL" 👇 que vamos te avisar e passar o acesso no seu direct.</w:t>
       </w:r>
     </w:p>
     <w:p>

</xml_diff>

<commit_message>
Ajusta legenda do carrossel e texto da imagem estática de convite ao grupo
Co-Authored-By: Claude Sonnet 5 <noreply@anthropic.com>
Claude-Session: https://claude.ai/code/session_01GQSqEjEuqv44iBdACeUWUZ
</commit_message>
<xml_diff>
--- a/eleva/carrossel-lancamento-portal-sindico.docx
+++ b/eleva/carrossel-lancamento-portal-sindico.docx
@@ -518,7 +518,7 @@
           <w:sz w:val="21"/>
           <w:szCs w:val="21"/>
         </w:rPr>
-        <w:t xml:space="preserve">Quer ser um dos primeiros a receber esse acesso gratuito? Comente "PORTAL" 👇 que vamos te avisar e passar o acesso no seu direct.</w:t>
+        <w:t xml:space="preserve">Quer ser um dos primeiros a receber esse acesso gratuito? Comente "PORTAL" 👇 e então, vamos te avisar e passar o acesso no seu direct.</w:t>
       </w:r>
     </w:p>
     <w:p>
@@ -646,31 +646,31 @@
           <w:sz w:val="21"/>
           <w:szCs w:val="21"/>
         </w:rPr>
-        <w:t xml:space="preserve">"Você é síndico e ainda não faz parte da nossa comunidade, Eleva Síndicos de Alta Performance?"</w:t>
-      </w:r>
-    </w:p>
-    <w:p>
-      <w:pPr>
-        <w:spacing w:after="160"/>
-      </w:pPr>
-      <w:r>
-        <w:rPr>
-          <w:sz w:val="21"/>
-          <w:szCs w:val="21"/>
-        </w:rPr>
-        <w:t xml:space="preserve">"Uma comunidade gratuita, no WhatsApp, com conteúdo semanal para o seu dia a dia de gestão."</w:t>
-      </w:r>
-    </w:p>
-    <w:p>
-      <w:pPr>
-        <w:spacing w:after="160"/>
-      </w:pPr>
-      <w:r>
-        <w:rPr>
-          <w:sz w:val="21"/>
-          <w:szCs w:val="21"/>
-        </w:rPr>
-        <w:t xml:space="preserve">"Comenta 'GRUPO' ou acesse pelo link da bio."</w:t>
+        <w:t xml:space="preserve">"Você é síndico e ainda não faz parte da nossa comunidade: Eleva - Síndicos de Alta Performance?"</w:t>
+      </w:r>
+    </w:p>
+    <w:p>
+      <w:pPr>
+        <w:spacing w:after="160"/>
+      </w:pPr>
+      <w:r>
+        <w:rPr>
+          <w:sz w:val="21"/>
+          <w:szCs w:val="21"/>
+        </w:rPr>
+        <w:t xml:space="preserve">"Uma comunidade gratuita, no WhatsApp, com conteúdos semanais para te ajudar no seu dia a dia e na sua gestão como síndico."</w:t>
+      </w:r>
+    </w:p>
+    <w:p>
+      <w:pPr>
+        <w:spacing w:after="160"/>
+      </w:pPr>
+      <w:r>
+        <w:rPr>
+          <w:sz w:val="21"/>
+          <w:szCs w:val="21"/>
+        </w:rPr>
+        <w:t xml:space="preserve">"Comente: 'GRUPO' e receba o convite no seu direct ou acesse pelo link da bio."</w:t>
       </w:r>
     </w:p>
     <w:p>

</xml_diff>

<commit_message>
Troca palavra-chave GRUPO por COMUNIDADE no post estático e story de convite, documenta versão Stories
Co-Authored-By: Claude Sonnet 5 <noreply@anthropic.com>
Claude-Session: https://claude.ai/code/session_01GQSqEjEuqv44iBdACeUWUZ
</commit_message>
<xml_diff>
--- a/eleva/carrossel-lancamento-portal-sindico.docx
+++ b/eleva/carrossel-lancamento-portal-sindico.docx
@@ -670,7 +670,7 @@
           <w:sz w:val="21"/>
           <w:szCs w:val="21"/>
         </w:rPr>
-        <w:t xml:space="preserve">"Comente: 'GRUPO' e receba o convite no seu direct ou acesse pelo link da bio."</w:t>
+        <w:t xml:space="preserve">"Comente: 'COMUNIDADE' e receba o convite no seu direct ou acesse pelo link da bio."</w:t>
       </w:r>
     </w:p>
     <w:p>
@@ -721,7 +721,7 @@
           <w:sz w:val="21"/>
           <w:szCs w:val="21"/>
         </w:rPr>
-        <w:t xml:space="preserve">Comente "GRUPO" 👇 e receba o convite no direct, ou acesse direto pelo link da bio.</w:t>
+        <w:t xml:space="preserve">Comente "COMUNIDADE" 👇 e receba o convite no direct, ou acesse direto pelo link da bio.</w:t>
       </w:r>
     </w:p>
     <w:p>
@@ -736,7 +736,7 @@
           <w:sz w:val="18"/>
           <w:szCs w:val="18"/>
         </w:rPr>
-        <w:t xml:space="preserve">Automação de direct (gatilho: comentário "GRUPO"):</w:t>
+        <w:t xml:space="preserve">Automação de direct (gatilho: comentário "COMUNIDADE"):</w:t>
       </w:r>
     </w:p>
     <w:p>
@@ -775,6 +775,141 @@
           <w:szCs w:val="20"/>
         </w:rPr>
         <w:t xml:space="preserve">🔗 https://chat.whatsapp.com/IPCOutpwO2rLJF2KmP99t9</w:t>
+      </w:r>
+    </w:p>
+    <w:p>
+      <w:pPr>
+        <w:spacing w:after="160"/>
+      </w:pPr>
+      <w:r>
+        <w:rPr>
+          <w:b/>
+          <w:bCs/>
+          <w:sz w:val="21"/>
+          <w:szCs w:val="21"/>
+        </w:rPr>
+        <w:t xml:space="preserve">Arquivo:</w:t>
+      </w:r>
+      <w:r>
+        <w:rPr>
+          <w:sz w:val="21"/>
+          <w:szCs w:val="21"/>
+        </w:rPr>
+        <w:t xml:space="preserve"> `post-estatico-convite-grupo-whatsapp.png`</w:t>
+      </w:r>
+    </w:p>
+    <w:p>
+      <w:pPr>
+        <w:pBdr>
+          <w:bottom w:val="single" w:color="cccccc" w:sz="6" w:space="4"/>
+        </w:pBdr>
+        <w:spacing w:after="200"/>
+      </w:pPr>
+    </w:p>
+    <w:p>
+      <w:pPr>
+        <w:pStyle w:val="Heading2"/>
+        <w:keepNext/>
+        <w:spacing w:after="150" w:before="300"/>
+      </w:pPr>
+      <w:r>
+        <w:t xml:space="preserve">Versão Stories — Convite para a comunidade Eleva</w:t>
+      </w:r>
+    </w:p>
+    <w:p>
+      <w:pPr>
+        <w:spacing w:after="160"/>
+      </w:pPr>
+      <w:r>
+        <w:rPr>
+          <w:b/>
+          <w:bCs/>
+          <w:sz w:val="21"/>
+          <w:szCs w:val="21"/>
+        </w:rPr>
+        <w:t xml:space="preserve">Onde postar:</w:t>
+      </w:r>
+      <w:r>
+        <w:rPr>
+          <w:sz w:val="21"/>
+          <w:szCs w:val="21"/>
+        </w:rPr>
+        <w:t xml:space="preserve"> Instagram, Stories (1080x1920)</w:t>
+      </w:r>
+    </w:p>
+    <w:p>
+      <w:pPr>
+        <w:spacing w:after="160"/>
+      </w:pPr>
+      <w:r>
+        <w:rPr>
+          <w:b/>
+          <w:bCs/>
+          <w:sz w:val="21"/>
+          <w:szCs w:val="21"/>
+        </w:rPr>
+        <w:t xml:space="preserve">Texto da imagem:</w:t>
+      </w:r>
+      <w:r>
+        <w:rPr>
+          <w:sz w:val="21"/>
+          <w:szCs w:val="21"/>
+        </w:rPr>
+        <w:t xml:space="preserve"> igual à versão feed, com o CTA adaptado para resposta de Stories:</w:t>
+      </w:r>
+    </w:p>
+    <w:p>
+      <w:pPr>
+        <w:spacing w:after="160"/>
+      </w:pPr>
+      <w:r>
+        <w:rPr>
+          <w:sz w:val="21"/>
+          <w:szCs w:val="21"/>
+        </w:rPr>
+        <w:t xml:space="preserve">"Responda este story com 'COMUNIDADE' e receba o convite no seu direct, ou acesse pelo link da bio."</w:t>
+      </w:r>
+    </w:p>
+    <w:p>
+      <w:pPr>
+        <w:spacing w:after="160"/>
+      </w:pPr>
+      <w:r>
+        <w:rPr>
+          <w:b/>
+          <w:bCs/>
+          <w:sz w:val="21"/>
+          <w:szCs w:val="21"/>
+        </w:rPr>
+        <w:t xml:space="preserve">Automação:</w:t>
+      </w:r>
+      <w:r>
+        <w:rPr>
+          <w:sz w:val="21"/>
+          <w:szCs w:val="21"/>
+        </w:rPr>
+        <w:t xml:space="preserve"> gatilho pela resposta ao Stories com a palavra "COMUNIDADE", mesmo texto e link da automação acima.</w:t>
+      </w:r>
+    </w:p>
+    <w:p>
+      <w:pPr>
+        <w:spacing w:after="160"/>
+      </w:pPr>
+      <w:r>
+        <w:rPr>
+          <w:b/>
+          <w:bCs/>
+          <w:sz w:val="21"/>
+          <w:szCs w:val="21"/>
+        </w:rPr>
+        <w:t xml:space="preserve">Arquivo:</w:t>
+      </w:r>
+      <w:r>
+        <w:rPr>
+          <w:sz w:val="21"/>
+          <w:szCs w:val="21"/>
+        </w:rPr>
+        <w:t xml:space="preserve"> `story-convite-grupo-whatsapp.png`</w:t>
       </w:r>
     </w:p>
     <w:sectPr>

</xml_diff>